<commit_message>
docs: extend V. KHÓ KHĂN and VI. KIẾN NGHỊ with phase detection items
</commit_message>
<xml_diff>
--- a/plans/reports/BÁO CÁO SINH HỌC (29-05-2026).docx
+++ b/plans/reports/BÁO CÁO SINH HỌC (29-05-2026).docx
@@ -2260,6 +2260,82 @@
       </w:r>
     </w:p>
     <w:p>
+      <w:r>
+        <w:rPr>
+          <w:i/>
+        </w:rPr>
+        <w:t>Bổ sung khó khăn từ phần Phase Boundary Detection (05/2026):</w:t>
+      </w:r>
+    </w:p>
+    <w:p>
+      <w:r>
+        <w:rPr>
+          <w:b/>
+        </w:rPr>
+        <w:t>Thiếu ground truth cho GGA:</w:t>
+      </w:r>
+    </w:p>
+    <w:p>
+      <w:r>
+        <w:t>Chỉ có 5 sheet GGA (25 sample sau khi tách block) có color marking yellow/white trong Excel. Quá ít để train mô hình ML — phải dùng thuật toán constrained change-point. Kết quả boundary ±1 = 84% (dưới mục tiêu 90%) trong khi Metal/HH đạt 98%+.</w:t>
+      </w:r>
+    </w:p>
+    <w:p>
+      <w:r>
+        <w:rPr>
+          <w:b/>
+        </w:rPr>
+        <w:t>Color marking không nhất quán trong Excel:</w:t>
+      </w:r>
+    </w:p>
+    <w:p>
+      <w:r>
+        <w:t>File Excel cũ (data/GGA-metal/) chỉ còn 5/183 sheet có color, đa số bị strip. Phải dùng file gốc data/BOD-Hieu/ (53/226 sheet Metal, 170/174 sheet HH). Một số sheet có header ở row 2 thay vì row 3, một sheet chứa 2-6 block side-by-side — cần auto-detect dynamic không thể giả định layout cố định.</w:t>
+      </w:r>
+    </w:p>
+    <w:p>
+      <w:r>
+        <w:rPr>
+          <w:b/>
+        </w:rPr>
+        <w:t>Distribution mismatch giữa training và inference:</w:t>
+      </w:r>
+    </w:p>
+    <w:p>
+      <w:r>
+        <w:t>Model Metal được train trên 53 sample đặc biệt (có color marking), không nhất thiết đại diện toàn bộ 348 mẫu Metal trong production. Validation chạy trên cùng training data → accuracy inflated. CV 93.2% là số generalization thật, nhưng vẫn chưa có holdout set độc lập.</w:t>
+      </w:r>
+    </w:p>
+    <w:p>
+      <w:r>
+        <w:rPr>
+          <w:b/>
+        </w:rPr>
+        <w:t>GroupKFold leakage suýt che giấu vấn đề:</w:t>
+      </w:r>
+    </w:p>
+    <w:p>
+      <w:r>
+        <w:t>Trong implementation lần đầu, noise augmentation (σ=0.05, 3x) gắn group name khác nhau cho bản sao (f"{sample}__noise{k}"), khiến GroupKFold đặt bản gốc và bản noise vào fold khác nhau → CV inflated từ 93.2% lên 98.5%. May mắn được code review phát hiện. Bài học: augmentation và CV grouping phải đồng bộ; noise augmentation không cải thiện accuracy nên đã bỏ.</w:t>
+      </w:r>
+    </w:p>
+    <w:p>
+      <w:r>
+        <w:rPr>
+          <w:b/>
+        </w:rPr>
+        <w:t>Toxicity âm cho mẫu sạch:</w:t>
+      </w:r>
+    </w:p>
+    <w:p>
+      <w:r>
+        <w:t>Với mẫu GGA sạch (không có độc chất), DDO phase 2 có thể tương đương hoặc cao hơn phase 1 do nhiễu — công thức (DDO₁ - DDO₂) / DDO₁ × 100 cho giá trị âm. Về mặt sinh học là hợp lệ (không có độc), nhưng dashboard hiện chưa có logic hiển thị riêng cho trường hợp này.</w:t>
+      </w:r>
+    </w:p>
+    <w:p>
+      <w:r/>
+    </w:p>
+    <w:p>
       <w:pPr>
         <w:pStyle w:val="Heading1"/>
       </w:pPr>
@@ -2286,6 +2362,82 @@
       <w:r>
         <w:t>Xem xét chấp nhận tolerance 0.3mV thay vì 0.2mV cho production use, vì accuracy cải thiện đáng kể (từ 73-88% lên 80-93%).</w:t>
       </w:r>
+    </w:p>
+    <w:p>
+      <w:r>
+        <w:rPr>
+          <w:i/>
+        </w:rPr>
+        <w:t>Bổ sung kiến nghị từ phần Phase Boundary Detection:</w:t>
+      </w:r>
+    </w:p>
+    <w:p>
+      <w:r>
+        <w:rPr>
+          <w:b/>
+        </w:rPr>
+        <w:t>Mở rộng GGA ground truth:</w:t>
+      </w:r>
+    </w:p>
+    <w:p>
+      <w:r>
+        <w:t>Đề xuất chuyên gia color-mark thêm khoảng 30-50 sheet GGA mới (yellow=stable, white=transition). Khi đủ dữ liệu (~80 sample) sẽ train được mô hình ML cho GGA tương tự Metal/HH, kỳ vọng boundary ±1 lên 95%+.</w:t>
+      </w:r>
+    </w:p>
+    <w:p>
+      <w:r>
+        <w:rPr>
+          <w:b/>
+        </w:rPr>
+        <w:t>Xây dựng holdout test set độc lập:</w:t>
+      </w:r>
+    </w:p>
+    <w:p>
+      <w:r>
+        <w:t>Tách 20% sample khỏi training/CV để làm holdout vĩnh viễn, không bao giờ dùng cho train. Đo accuracy thật của Metal/HH model trên holdout này — kỳ vọng ~91-93% (gần CV).</w:t>
+      </w:r>
+    </w:p>
+    <w:p>
+      <w:r>
+        <w:rPr>
+          <w:b/>
+        </w:rPr>
+        <w:t>Dashboard UX cho phase detection:</w:t>
+      </w:r>
+    </w:p>
+    <w:p>
+      <w:r>
+        <w:t>Thêm logic hiển thị riêng khi toxicity âm (mẫu sạch, không độc) — thay vì hiển thị "-23.6%", có thể hiển thị "~0% (mẫu sạch)". Đồng thời cảnh báo rõ khi phase_confidence trung bình &lt; 0.6 và highlight peak transition trong table peak với màu khác (đỏ nhạt).</w:t>
+      </w:r>
+    </w:p>
+    <w:p>
+      <w:r>
+        <w:rPr>
+          <w:b/>
+        </w:rPr>
+        <w:t>Monitoring chất lượng phase detection trong production:</w:t>
+      </w:r>
+    </w:p>
+    <w:p>
+      <w:r>
+        <w:t>Log phase_confidence và phân phối Tag (phase1/transition/phase2 ratio) cho mỗi prediction. Nếu phân phối lệch bất thường (vd &gt; 50% transition) → flag để xem xét. Đây là tín hiệu sớm khi model gặp distribution shift trong dữ liệu mới.</w:t>
+      </w:r>
+    </w:p>
+    <w:p>
+      <w:r>
+        <w:rPr>
+          <w:b/>
+        </w:rPr>
+        <w:t>Tích hợp confidence vào Excel export:</w:t>
+      </w:r>
+    </w:p>
+    <w:p>
+      <w:r>
+        <w:t>Bổ sung cột phase_confidence vào file Excel report để chuyên gia xem được mức độ chắc chắn của model. Đặc biệt hữu ích khi review các mẫu biên/khó (Cr(VI) nồng độ thấp, plateau không đều).</w:t>
+      </w:r>
+    </w:p>
+    <w:p>
+      <w:r/>
     </w:p>
     <w:p>
       <w:r>

</xml_diff>

<commit_message>
fix(report): correct CatBoost recall numbers to 518-file validation (GGA 88.1%, Metal 82.7%)
</commit_message>
<xml_diff>
--- a/plans/reports/BÁO CÁO SINH HỌC (29-05-2026).docx
+++ b/plans/reports/BÁO CÁO SINH HỌC (29-05-2026).docx
@@ -1982,7 +1982,7 @@
           </w:tcPr>
           <w:p>
             <w:r>
-              <w:t>CatBoost (v3 - E1 winner)</w:t>
+              <w:t>CatBoost v3 (E1 winner) — Overall</w:t>
             </w:r>
           </w:p>
         </w:tc>
@@ -1992,7 +1992,7 @@
           </w:tcPr>
           <w:p>
             <w:r>
-              <w:t>iterations=300, lr=0.05, depth=8, balanced weights, 81 features</w:t>
+              <w:t>iterations=300, lr=0.05, depth=8, class_weight=balanced, 81 features</w:t>
             </w:r>
           </w:p>
         </w:tc>
@@ -2002,7 +2002,71 @@
           </w:tcPr>
           <w:p>
             <w:r>
-              <w:t>0.844</w:t>
+              <w:t>84.4% (437/518 file)</w:t>
+            </w:r>
+          </w:p>
+        </w:tc>
+      </w:tr>
+      <w:tr>
+        <w:tc>
+          <w:tcPr>
+            <w:tcW w:type="dxa" w:w="2876"/>
+          </w:tcPr>
+          <w:p>
+            <w:r>
+              <w:t>CatBoost v3 — GGA recall</w:t>
+            </w:r>
+          </w:p>
+        </w:tc>
+        <w:tc>
+          <w:tcPr>
+            <w:tcW w:type="dxa" w:w="3104"/>
+          </w:tcPr>
+          <w:p>
+            <w:r>
+              <w:t>Validation trên 518 file thực tế (align training + noise σ=0.08 + oversample 45%)</w:t>
+            </w:r>
+          </w:p>
+        </w:tc>
+        <w:tc>
+          <w:tcPr>
+            <w:tcW w:type="dxa" w:w="2876"/>
+          </w:tcPr>
+          <w:p>
+            <w:r>
+              <w:t>88.1% (140/159)</w:t>
+            </w:r>
+          </w:p>
+        </w:tc>
+      </w:tr>
+      <w:tr>
+        <w:tc>
+          <w:tcPr>
+            <w:tcW w:type="dxa" w:w="2876"/>
+          </w:tcPr>
+          <w:p>
+            <w:r>
+              <w:t>CatBoost v3 — Metal recall</w:t>
+            </w:r>
+          </w:p>
+        </w:tc>
+        <w:tc>
+          <w:tcPr>
+            <w:tcW w:type="dxa" w:w="3104"/>
+          </w:tcPr>
+          <w:p>
+            <w:r>
+              <w:t>Validation trên 518 file thực tế</w:t>
+            </w:r>
+          </w:p>
+        </w:tc>
+        <w:tc>
+          <w:tcPr>
+            <w:tcW w:type="dxa" w:w="2876"/>
+          </w:tcPr>
+          <w:p>
+            <w:r>
+              <w:t>82.7% (297/359)</w:t>
             </w:r>
           </w:p>
         </w:tc>

</xml_diff>